<commit_message>
Actualizando formato de Notificaciones
</commit_message>
<xml_diff>
--- a/public/report_templates/creditos/notificaciones/LIQ_PAGO_AVAL.docx
+++ b/public/report_templates/creditos/notificaciones/LIQ_PAGO_AVAL.docx
@@ -52,29 +52,7 @@
           <w:szCs w:val="24"/>
           <w:u w:val="single"/>
         </w:rPr>
-        <w:t xml:space="preserve"> </w:t>
-      </w:r>
-      <w:proofErr w:type="spellStart"/>
-      <w:r>
-        <w:rPr>
-          <w:rFonts w:ascii="Times New Roman" w:hAnsi="Times New Roman" w:cs="Times New Roman"/>
-          <w:b/>
-          <w:sz w:val="24"/>
-          <w:szCs w:val="24"/>
-          <w:u w:val="single"/>
-        </w:rPr>
-        <w:t>N°</w:t>
-      </w:r>
-      <w:proofErr w:type="spellEnd"/>
-      <w:r>
-        <w:rPr>
-          <w:rFonts w:ascii="Times New Roman" w:hAnsi="Times New Roman" w:cs="Times New Roman"/>
-          <w:b/>
-          <w:sz w:val="24"/>
-          <w:szCs w:val="24"/>
-          <w:u w:val="single"/>
-        </w:rPr>
-        <w:t xml:space="preserve"> </w:t>
+        <w:t xml:space="preserve"> N° </w:t>
       </w:r>
       <w:r>
         <w:rPr>
@@ -1287,87 +1265,6 @@
         <w:jc w:val="both"/>
         <w:rPr>
           <w:rFonts w:ascii="Times New Roman" w:hAnsi="Times New Roman" w:cs="Times New Roman"/>
-          <w:b/>
-        </w:rPr>
-      </w:pPr>
-      <w:r>
-        <w:rPr>
-          <w:rFonts w:ascii="Times New Roman" w:hAnsi="Times New Roman" w:cs="Times New Roman"/>
-          <w:b/>
-        </w:rPr>
-        <w:t>COSTO DEL PRESENTE DOCUMENTO</w:t>
-      </w:r>
-      <w:r>
-        <w:rPr>
-          <w:rFonts w:ascii="Times New Roman" w:hAnsi="Times New Roman" w:cs="Times New Roman"/>
-          <w:b/>
-        </w:rPr>
-        <w:t>:</w:t>
-      </w:r>
-      <w:r>
-        <w:rPr>
-          <w:rFonts w:ascii="Times New Roman" w:hAnsi="Times New Roman" w:cs="Times New Roman"/>
-        </w:rPr>
-        <w:t xml:space="preserve"> </w:t>
-      </w:r>
-      <w:r>
-        <w:rPr>
-          <w:rFonts w:ascii="Times New Roman" w:hAnsi="Times New Roman" w:cs="Times New Roman"/>
-          <w:b/>
-        </w:rPr>
-        <w:t>S/</w:t>
-      </w:r>
-      <w:r>
-        <w:rPr>
-          <w:rFonts w:ascii="Times New Roman" w:hAnsi="Times New Roman" w:cs="Times New Roman"/>
-          <w:b/>
-        </w:rPr>
-        <w:t xml:space="preserve"> </w:t>
-      </w:r>
-      <w:r>
-        <w:rPr>
-          <w:rFonts w:ascii="Times New Roman" w:hAnsi="Times New Roman" w:cs="Times New Roman"/>
-          <w:b/>
-        </w:rPr>
-        <w:t>{</w:t>
-      </w:r>
-      <w:proofErr w:type="spellStart"/>
-      <w:r>
-        <w:rPr>
-          <w:rFonts w:ascii="Times New Roman" w:hAnsi="Times New Roman" w:cs="Times New Roman"/>
-          <w:b/>
-        </w:rPr>
-        <w:t>monto_notificacion</w:t>
-      </w:r>
-      <w:proofErr w:type="spellEnd"/>
-      <w:r>
-        <w:rPr>
-          <w:rFonts w:ascii="Times New Roman" w:hAnsi="Times New Roman" w:cs="Times New Roman"/>
-          <w:b/>
-        </w:rPr>
-        <w:t>}</w:t>
-      </w:r>
-      <w:r>
-        <w:rPr>
-          <w:rFonts w:ascii="Times New Roman" w:hAnsi="Times New Roman" w:cs="Times New Roman"/>
-        </w:rPr>
-        <w:t xml:space="preserve"> </w:t>
-      </w:r>
-      <w:r>
-        <w:rPr>
-          <w:rFonts w:ascii="Times New Roman" w:hAnsi="Times New Roman" w:cs="Times New Roman"/>
-          <w:b/>
-        </w:rPr>
-        <w:t xml:space="preserve">(evite pagar este importe acercándose a nuestra oficina antes de las 24 horas) </w:t>
-      </w:r>
-    </w:p>
-    <w:p>
-      <w:pPr>
-        <w:spacing w:line="276" w:lineRule="auto"/>
-        <w:ind w:firstLine="708"/>
-        <w:jc w:val="both"/>
-        <w:rPr>
-          <w:rFonts w:ascii="Times New Roman" w:hAnsi="Times New Roman" w:cs="Times New Roman"/>
         </w:rPr>
       </w:pPr>
       <w:r>
@@ -1448,88 +1345,160 @@
         <w:spacing w:after="0" w:line="240" w:lineRule="auto"/>
         <w:rPr>
           <w:rFonts w:ascii="Times New Roman" w:hAnsi="Times New Roman" w:cs="Times New Roman"/>
+          <w:sz w:val="16"/>
+          <w:szCs w:val="16"/>
+        </w:rPr>
+      </w:pPr>
+    </w:p>
+    <w:p>
+      <w:pPr>
+        <w:spacing w:after="0" w:line="240" w:lineRule="auto"/>
+        <w:rPr>
+          <w:rFonts w:ascii="Times New Roman" w:hAnsi="Times New Roman" w:cs="Times New Roman"/>
+          <w:sz w:val="16"/>
+          <w:szCs w:val="16"/>
+        </w:rPr>
+      </w:pPr>
+    </w:p>
+    <w:p>
+      <w:pPr>
+        <w:spacing w:after="0" w:line="240" w:lineRule="auto"/>
+        <w:rPr>
+          <w:rFonts w:ascii="Times New Roman" w:hAnsi="Times New Roman" w:cs="Times New Roman"/>
+          <w:sz w:val="16"/>
+          <w:szCs w:val="16"/>
+        </w:rPr>
+      </w:pPr>
+    </w:p>
+    <w:p>
+      <w:pPr>
+        <w:spacing w:after="0" w:line="240" w:lineRule="auto"/>
+        <w:rPr>
+          <w:rFonts w:ascii="Times New Roman" w:hAnsi="Times New Roman" w:cs="Times New Roman"/>
+          <w:sz w:val="16"/>
+          <w:szCs w:val="16"/>
+        </w:rPr>
+      </w:pPr>
+    </w:p>
+    <w:p>
+      <w:pPr>
+        <w:spacing w:line="276" w:lineRule="auto"/>
+        <w:jc w:val="both"/>
+        <w:rPr>
+          <w:rFonts w:ascii="Cambria" w:hAnsi="Cambria" w:cs="Times New Roman"/>
           <w:i/>
           <w:iCs/>
           <w:sz w:val="16"/>
           <w:szCs w:val="16"/>
         </w:rPr>
       </w:pPr>
-      <w:r>
-        <w:rPr>
-          <w:rFonts w:ascii="Times New Roman" w:hAnsi="Times New Roman" w:cs="Times New Roman"/>
+      <w:bookmarkStart w:id="2" w:name="_Hlk211976435"/>
+      <w:r>
+        <w:rPr>
+          <w:rFonts w:ascii="Cambria" w:hAnsi="Cambria" w:cs="Times New Roman"/>
+          <w:b/>
           <w:i/>
           <w:iCs/>
           <w:sz w:val="16"/>
           <w:szCs w:val="16"/>
         </w:rPr>
-        <w:t>(*) Monto que incluye: capital, intereses, moras y notificaciones pendientes de pago a la fecha</w:t>
-      </w:r>
-      <w:r>
-        <w:rPr>
-          <w:rFonts w:ascii="Times New Roman" w:hAnsi="Times New Roman" w:cs="Times New Roman"/>
+        <w:t>COSTO POR NOTIFICACIÓN DE CRÉDITO:</w:t>
+      </w:r>
+      <w:r>
+        <w:rPr>
+          <w:rFonts w:ascii="Cambria" w:hAnsi="Cambria" w:cs="Times New Roman"/>
           <w:i/>
           <w:iCs/>
           <w:sz w:val="16"/>
           <w:szCs w:val="16"/>
         </w:rPr>
-        <w:t>.</w:t>
-      </w:r>
-    </w:p>
-    <w:p>
-      <w:pPr>
-        <w:spacing w:after="0" w:line="240" w:lineRule="auto"/>
-        <w:rPr>
-          <w:rFonts w:ascii="Times New Roman" w:hAnsi="Times New Roman" w:cs="Times New Roman"/>
+        <w:t xml:space="preserve"> </w:t>
+      </w:r>
+      <w:r>
+        <w:rPr>
+          <w:rFonts w:ascii="Cambria" w:hAnsi="Cambria" w:cs="Times New Roman"/>
+          <w:b/>
           <w:i/>
           <w:iCs/>
           <w:sz w:val="16"/>
           <w:szCs w:val="16"/>
         </w:rPr>
-      </w:pPr>
-      <w:r>
-        <w:rPr>
-          <w:rFonts w:ascii="Times New Roman" w:hAnsi="Times New Roman" w:cs="Times New Roman"/>
+        <w:t xml:space="preserve">S/ </w:t>
+      </w:r>
+      <w:r>
+        <w:rPr>
+          <w:rFonts w:ascii="Cambria" w:hAnsi="Cambria" w:cs="Times New Roman"/>
+          <w:b/>
           <w:i/>
           <w:iCs/>
           <w:sz w:val="16"/>
           <w:szCs w:val="16"/>
         </w:rPr>
-        <w:t>Sírvase a dejar sin efecto la presente, si al momento de recibir usted canceló la deuda.</w:t>
-      </w:r>
-    </w:p>
-    <w:p>
-      <w:pPr>
-        <w:spacing w:line="240" w:lineRule="auto"/>
-        <w:rPr>
-          <w:rFonts w:ascii="Times New Roman" w:hAnsi="Times New Roman" w:cs="Times New Roman"/>
-          <w:sz w:val="16"/>
-          <w:szCs w:val="16"/>
-        </w:rPr>
-      </w:pPr>
-      <w:r>
-        <w:rPr>
-          <w:rFonts w:ascii="Times New Roman" w:hAnsi="Times New Roman" w:cs="Times New Roman"/>
+        <w:t>{</w:t>
+      </w:r>
+      <w:proofErr w:type="spellStart"/>
+      <w:r>
+        <w:rPr>
+          <w:rFonts w:ascii="Cambria" w:hAnsi="Cambria" w:cs="Times New Roman"/>
+          <w:b/>
           <w:i/>
           <w:iCs/>
           <w:sz w:val="16"/>
           <w:szCs w:val="16"/>
         </w:rPr>
-        <w:t>Usted entregará un monto de pago siempre que el portador le entregue un recibo de pago provisional, la empresa no será responsable por pagos efectuados sin presentar su recibo de pago provisional</w:t>
-      </w:r>
-      <w:r>
-        <w:rPr>
-          <w:rFonts w:ascii="Times New Roman" w:hAnsi="Times New Roman" w:cs="Times New Roman"/>
+        <w:t>monto_notificacion</w:t>
+      </w:r>
+      <w:proofErr w:type="spellEnd"/>
+      <w:r>
+        <w:rPr>
+          <w:rFonts w:ascii="Cambria" w:hAnsi="Cambria" w:cs="Times New Roman"/>
+          <w:b/>
+          <w:i/>
+          <w:iCs/>
           <w:sz w:val="16"/>
           <w:szCs w:val="16"/>
         </w:rPr>
-        <w:t>.</w:t>
-      </w:r>
+        <w:t>}</w:t>
+      </w:r>
+      <w:r>
+        <w:rPr>
+          <w:rFonts w:ascii="Cambria" w:hAnsi="Cambria" w:cs="Times New Roman"/>
+          <w:b/>
+          <w:i/>
+          <w:iCs/>
+          <w:sz w:val="16"/>
+          <w:szCs w:val="16"/>
+        </w:rPr>
+        <w:t xml:space="preserve"> </w:t>
+      </w:r>
+      <w:r>
+        <w:rPr>
+          <w:rFonts w:ascii="Cambria" w:hAnsi="Cambria" w:cs="Times New Roman"/>
+          <w:b/>
+          <w:i/>
+          <w:iCs/>
+          <w:sz w:val="16"/>
+          <w:szCs w:val="16"/>
+        </w:rPr>
+        <w:t>(evite pagar este importe acercándose a nuestra oficina antes de las 24 horas)</w:t>
+      </w:r>
+      <w:r>
+        <w:rPr>
+          <w:rFonts w:ascii="Cambria" w:hAnsi="Cambria" w:cs="Times New Roman"/>
+          <w:i/>
+          <w:iCs/>
+          <w:sz w:val="16"/>
+          <w:szCs w:val="16"/>
+        </w:rPr>
+        <w:t xml:space="preserve"> </w:t>
+      </w:r>
+      <w:bookmarkEnd w:id="2"/>
     </w:p>
     <w:sectPr>
       <w:headerReference w:type="default" r:id="rId6"/>
       <w:footerReference w:type="default" r:id="rId7"/>
       <w:pgSz w:w="11906" w:h="16838"/>
-      <w:pgMar w:top="1418" w:right="1276" w:bottom="851" w:left="1276" w:header="709" w:footer="709" w:gutter="0"/>
+      <w:pgMar w:top="1418" w:right="1276" w:bottom="851" w:left="1276" w:header="709" w:footer="340" w:gutter="0"/>
       <w:cols w:space="708"/>
       <w:docGrid w:linePitch="360"/>
     </w:sectPr>
@@ -1566,29 +1535,40 @@
 <w:ftr xmlns:wpc="http://schemas.microsoft.com/office/word/2010/wordprocessingCanvas" xmlns:cx="http://schemas.microsoft.com/office/drawing/2014/chartex" xmlns:cx1="http://schemas.microsoft.com/office/drawing/2015/9/8/chartex" xmlns:cx2="http://schemas.microsoft.com/office/drawing/2015/10/21/chartex" xmlns:cx3="http://schemas.microsoft.com/office/drawing/2016/5/9/chartex" xmlns:cx4="http://schemas.microsoft.com/office/drawing/2016/5/10/chartex" xmlns:cx5="http://schemas.microsoft.com/office/drawing/2016/5/11/chartex" xmlns:cx6="http://schemas.microsoft.com/office/drawing/2016/5/12/chartex" xmlns:cx7="http://schemas.microsoft.com/office/drawing/2016/5/13/chartex" xmlns:cx8="http://schemas.microsoft.com/office/drawing/2016/5/14/chartex" xmlns:mc="http://schemas.openxmlformats.org/markup-compatibility/2006" xmlns:aink="http://schemas.microsoft.com/office/drawing/2016/ink" xmlns:am3d="http://schemas.microsoft.com/office/drawing/2017/model3d" xmlns:o="urn:schemas-microsoft-com:office:office" xmlns:oel="http://schemas.microsoft.com/office/2019/extlst" xmlns:r="http://schemas.openxmlformats.org/officeDocument/2006/relationships" xmlns:m="http://schemas.openxmlformats.org/officeDocument/2006/math" xmlns:v="urn:schemas-microsoft-com:vml" xmlns:wp14="http://schemas.microsoft.com/office/word/2010/wordprocessingDrawing" xmlns:wp="http://schemas.openxmlformats.org/drawingml/2006/wordprocessingDrawing" xmlns:w10="urn:schemas-microsoft-com:office:word" xmlns:w="http://schemas.openxmlformats.org/wordprocessingml/2006/main" xmlns:w14="http://schemas.microsoft.com/office/word/2010/wordml" xmlns:w15="http://schemas.microsoft.com/office/word/2012/wordml" xmlns:w16cex="http://schemas.microsoft.com/office/word/2018/wordml/cex" xmlns:w16cid="http://schemas.microsoft.com/office/word/2016/wordml/cid" xmlns:w16="http://schemas.microsoft.com/office/word/2018/wordml" xmlns:w16sdtdh="http://schemas.microsoft.com/office/word/2020/wordml/sdtdatahash" xmlns:w16se="http://schemas.microsoft.com/office/word/2015/wordml/symex" xmlns:wpg="http://schemas.microsoft.com/office/word/2010/wordprocessingGroup" xmlns:wpi="http://schemas.microsoft.com/office/word/2010/wordprocessingInk" xmlns:wne="http://schemas.microsoft.com/office/word/2006/wordml" xmlns:wps="http://schemas.microsoft.com/office/word/2010/wordprocessingShape" mc:Ignorable="w14 w15 w16se w16cid w16 w16cex w16sdtdh wp14">
   <w:p>
     <w:pPr>
-      <w:pStyle w:val="Piedepgina"/>
-      <w:tabs>
-        <w:tab w:val="clear" w:pos="8504"/>
-      </w:tabs>
+      <w:pStyle w:val="Sinespaciado"/>
+      <w:ind w:left="708"/>
+      <w:jc w:val="both"/>
+      <w:rPr>
+        <w:sz w:val="14"/>
+        <w:szCs w:val="14"/>
+      </w:rPr>
     </w:pPr>
+    <w:bookmarkStart w:id="3" w:name="_Hlk211976455"/>
+    <w:bookmarkStart w:id="4" w:name="_Hlk211976456"/>
+    <w:bookmarkStart w:id="5" w:name="_Hlk211976470"/>
+    <w:bookmarkStart w:id="6" w:name="_Hlk211976471"/>
+    <w:bookmarkStart w:id="7" w:name="_Hlk211976478"/>
+    <w:bookmarkStart w:id="8" w:name="_Hlk211976479"/>
     <w:r>
       <w:rPr>
         <w:noProof/>
+        <w:sz w:val="18"/>
+        <w:szCs w:val="18"/>
         <w:lang w:eastAsia="es-419"/>
       </w:rPr>
       <w:drawing>
-        <wp:anchor distT="0" distB="0" distL="114300" distR="114300" simplePos="0" relativeHeight="251656704" behindDoc="1" locked="0" layoutInCell="1" allowOverlap="1" wp14:anchorId="682B33F6" wp14:editId="5C75597B">
+        <wp:anchor distT="0" distB="0" distL="114300" distR="114300" simplePos="0" relativeHeight="251662848" behindDoc="1" locked="0" layoutInCell="1" allowOverlap="1" wp14:anchorId="313AC80A" wp14:editId="3718E42D">
           <wp:simplePos x="0" y="0"/>
           <wp:positionH relativeFrom="page">
-            <wp:align>right</wp:align>
+            <wp:posOffset>6457950</wp:posOffset>
           </wp:positionH>
           <wp:positionV relativeFrom="paragraph">
-            <wp:posOffset>-3975735</wp:posOffset>
+            <wp:posOffset>-3832860</wp:posOffset>
           </wp:positionV>
           <wp:extent cx="1074383" cy="4585503"/>
           <wp:effectExtent l="0" t="0" r="0" b="5715"/>
           <wp:wrapNone/>
-          <wp:docPr id="8" name="Imagen 8" descr="12121-02"/>
+          <wp:docPr id="2" name="Imagen 2" descr="12121-02"/>
           <wp:cNvGraphicFramePr>
             <a:graphicFrameLocks xmlns:a="http://schemas.openxmlformats.org/drawingml/2006/main" noChangeAspect="1"/>
           </wp:cNvGraphicFramePr>
@@ -1617,7 +1597,7 @@
                 <pic:spPr bwMode="auto">
                   <a:xfrm>
                     <a:off x="0" y="0"/>
-                    <a:ext cx="1073785" cy="4585335"/>
+                    <a:ext cx="1074383" cy="4585503"/>
                   </a:xfrm>
                   <a:prstGeom prst="rect">
                     <a:avLst/>
@@ -1637,8 +1617,312 @@
       </w:drawing>
     </w:r>
     <w:r>
+      <w:rPr>
+        <w:sz w:val="14"/>
+        <w:szCs w:val="14"/>
+      </w:rPr>
+      <w:t>OFICINA PRINCIPAL</w:t>
+    </w:r>
+    <w:r>
+      <w:rPr>
+        <w:sz w:val="14"/>
+        <w:szCs w:val="14"/>
+      </w:rPr>
       <w:tab/>
     </w:r>
+    <w:r>
+      <w:rPr>
+        <w:sz w:val="14"/>
+        <w:szCs w:val="14"/>
+      </w:rPr>
+      <w:tab/>
+    </w:r>
+    <w:r>
+      <w:rPr>
+        <w:sz w:val="14"/>
+        <w:szCs w:val="14"/>
+      </w:rPr>
+      <w:tab/>
+      <w:t>AGENCIA HUANCAYO</w:t>
+    </w:r>
+    <w:r>
+      <w:rPr>
+        <w:sz w:val="14"/>
+        <w:szCs w:val="14"/>
+      </w:rPr>
+      <w:tab/>
+    </w:r>
+    <w:r>
+      <w:rPr>
+        <w:sz w:val="14"/>
+        <w:szCs w:val="14"/>
+      </w:rPr>
+      <w:tab/>
+    </w:r>
+    <w:r>
+      <w:rPr>
+        <w:sz w:val="14"/>
+        <w:szCs w:val="14"/>
+      </w:rPr>
+      <w:tab/>
+    </w:r>
+    <w:r>
+      <w:rPr>
+        <w:sz w:val="14"/>
+        <w:szCs w:val="14"/>
+      </w:rPr>
+      <w:tab/>
+      <w:t>AGENCIA PAMPAS</w:t>
+    </w:r>
+  </w:p>
+  <w:p>
+    <w:pPr>
+      <w:pStyle w:val="Sinespaciado"/>
+      <w:ind w:left="708"/>
+      <w:jc w:val="both"/>
+      <w:rPr>
+        <w:sz w:val="14"/>
+        <w:szCs w:val="14"/>
+      </w:rPr>
+    </w:pPr>
+    <w:r>
+      <w:rPr>
+        <w:sz w:val="14"/>
+        <w:szCs w:val="14"/>
+      </w:rPr>
+      <w:t>Prolog. Huánuco N°317</w:t>
+    </w:r>
+    <w:r>
+      <w:rPr>
+        <w:sz w:val="14"/>
+        <w:szCs w:val="14"/>
+      </w:rPr>
+      <w:tab/>
+    </w:r>
+    <w:r>
+      <w:rPr>
+        <w:sz w:val="14"/>
+        <w:szCs w:val="14"/>
+      </w:rPr>
+      <w:tab/>
+    </w:r>
+    <w:r>
+      <w:rPr>
+        <w:sz w:val="14"/>
+        <w:szCs w:val="14"/>
+      </w:rPr>
+      <w:tab/>
+      <w:t>Prolog. Huánuco N°317</w:t>
+    </w:r>
+    <w:r>
+      <w:rPr>
+        <w:sz w:val="14"/>
+        <w:szCs w:val="14"/>
+      </w:rPr>
+      <w:tab/>
+    </w:r>
+    <w:r>
+      <w:rPr>
+        <w:sz w:val="14"/>
+        <w:szCs w:val="14"/>
+      </w:rPr>
+      <w:tab/>
+    </w:r>
+    <w:r>
+      <w:rPr>
+        <w:sz w:val="14"/>
+        <w:szCs w:val="14"/>
+      </w:rPr>
+      <w:tab/>
+    </w:r>
+    <w:r>
+      <w:rPr>
+        <w:sz w:val="14"/>
+        <w:szCs w:val="14"/>
+      </w:rPr>
+      <w:tab/>
+      <w:t>Jr. Lima N°145</w:t>
+    </w:r>
+  </w:p>
+  <w:p>
+    <w:pPr>
+      <w:pStyle w:val="Sinespaciado"/>
+      <w:ind w:left="708"/>
+      <w:jc w:val="both"/>
+      <w:rPr>
+        <w:i/>
+        <w:iCs/>
+        <w:sz w:val="14"/>
+        <w:szCs w:val="14"/>
+      </w:rPr>
+    </w:pPr>
+    <w:r>
+      <w:rPr>
+        <w:i/>
+        <w:iCs/>
+        <w:sz w:val="14"/>
+        <w:szCs w:val="14"/>
+      </w:rPr>
+      <w:t>(Esquina con Atahualpa)</w:t>
+    </w:r>
+    <w:r>
+      <w:rPr>
+        <w:i/>
+        <w:iCs/>
+        <w:sz w:val="14"/>
+        <w:szCs w:val="14"/>
+      </w:rPr>
+      <w:tab/>
+    </w:r>
+    <w:r>
+      <w:rPr>
+        <w:i/>
+        <w:iCs/>
+        <w:sz w:val="14"/>
+        <w:szCs w:val="14"/>
+      </w:rPr>
+      <w:tab/>
+    </w:r>
+    <w:r>
+      <w:rPr>
+        <w:i/>
+        <w:iCs/>
+        <w:sz w:val="14"/>
+        <w:szCs w:val="14"/>
+      </w:rPr>
+      <w:tab/>
+      <w:t>(Esquina con Atahualpa)</w:t>
+    </w:r>
+    <w:r>
+      <w:rPr>
+        <w:i/>
+        <w:iCs/>
+        <w:sz w:val="14"/>
+        <w:szCs w:val="14"/>
+      </w:rPr>
+      <w:tab/>
+    </w:r>
+    <w:r>
+      <w:rPr>
+        <w:i/>
+        <w:iCs/>
+        <w:sz w:val="14"/>
+        <w:szCs w:val="14"/>
+      </w:rPr>
+      <w:tab/>
+    </w:r>
+    <w:r>
+      <w:rPr>
+        <w:i/>
+        <w:iCs/>
+        <w:sz w:val="14"/>
+        <w:szCs w:val="14"/>
+      </w:rPr>
+      <w:tab/>
+    </w:r>
+    <w:r>
+      <w:rPr>
+        <w:i/>
+        <w:iCs/>
+        <w:sz w:val="14"/>
+        <w:szCs w:val="14"/>
+      </w:rPr>
+      <w:tab/>
+      <w:t>Parque principal</w:t>
+    </w:r>
+  </w:p>
+  <w:p>
+    <w:pPr>
+      <w:pStyle w:val="Sinespaciado"/>
+      <w:ind w:left="708"/>
+      <w:jc w:val="both"/>
+      <w:rPr>
+        <w:i/>
+        <w:iCs/>
+        <w:sz w:val="14"/>
+        <w:szCs w:val="14"/>
+      </w:rPr>
+    </w:pPr>
+    <w:r>
+      <w:rPr>
+        <w:i/>
+        <w:iCs/>
+        <w:sz w:val="14"/>
+        <w:szCs w:val="14"/>
+      </w:rPr>
+      <w:t>Teléfono (064) 203680</w:t>
+    </w:r>
+    <w:r>
+      <w:rPr>
+        <w:i/>
+        <w:iCs/>
+        <w:sz w:val="14"/>
+        <w:szCs w:val="14"/>
+      </w:rPr>
+      <w:tab/>
+    </w:r>
+    <w:r>
+      <w:rPr>
+        <w:i/>
+        <w:iCs/>
+        <w:sz w:val="14"/>
+        <w:szCs w:val="14"/>
+      </w:rPr>
+      <w:tab/>
+    </w:r>
+    <w:r>
+      <w:rPr>
+        <w:i/>
+        <w:iCs/>
+        <w:sz w:val="14"/>
+        <w:szCs w:val="14"/>
+      </w:rPr>
+      <w:tab/>
+      <w:t>Teléfono (064) 203680</w:t>
+    </w:r>
+    <w:r>
+      <w:rPr>
+        <w:i/>
+        <w:iCs/>
+        <w:sz w:val="14"/>
+        <w:szCs w:val="14"/>
+      </w:rPr>
+      <w:tab/>
+    </w:r>
+    <w:r>
+      <w:rPr>
+        <w:i/>
+        <w:iCs/>
+        <w:sz w:val="14"/>
+        <w:szCs w:val="14"/>
+      </w:rPr>
+      <w:tab/>
+    </w:r>
+    <w:r>
+      <w:rPr>
+        <w:i/>
+        <w:iCs/>
+        <w:sz w:val="14"/>
+        <w:szCs w:val="14"/>
+      </w:rPr>
+      <w:tab/>
+    </w:r>
+    <w:r>
+      <w:rPr>
+        <w:i/>
+        <w:iCs/>
+        <w:sz w:val="14"/>
+        <w:szCs w:val="14"/>
+      </w:rPr>
+      <w:tab/>
+      <w:t>Teléf. 990363348</w:t>
+    </w:r>
+    <w:bookmarkEnd w:id="3"/>
+    <w:bookmarkEnd w:id="4"/>
+    <w:bookmarkEnd w:id="5"/>
+    <w:bookmarkEnd w:id="6"/>
+    <w:bookmarkEnd w:id="7"/>
+    <w:bookmarkEnd w:id="8"/>
   </w:p>
 </w:ftr>
 </file>
@@ -2454,6 +2738,18 @@
       </w:tblBorders>
     </w:tblPr>
   </w:style>
+  <w:style w:type="paragraph" w:styleId="Sinespaciado">
+    <w:name w:val="No Spacing"/>
+    <w:uiPriority w:val="1"/>
+    <w:qFormat/>
+    <w:rsid w:val="007F10DF"/>
+    <w:pPr>
+      <w:spacing w:after="0" w:line="240" w:lineRule="auto"/>
+    </w:pPr>
+    <w:rPr>
+      <w:lang w:val="es-PE"/>
+    </w:rPr>
+  </w:style>
 </w:styles>
 </file>
 

</xml_diff>